<commit_message>
Rename the site to Better Delivery Toolkit, at better-delivery-toolkit
The name, credit line, page titles and link previews now say Better
Delivery Toolkit, keeping the tagline (lean, agile and hybrid tools for
teams, facilitators and leaders). The address moves to
eparker71.github.io/better-delivery-toolkit with the repo rename. Every
board's PDF is remade, since the address is printed on each one, and the
preview image is regenerated.

Co-Authored-By: Claude Opus 5.5 <noreply@anthropic.com>
</commit_message>
<xml_diff>
--- a/guides/facilitator-guide-a3-problem-solving.docx
+++ b/guides/facilitator-guide-a3-problem-solving.docx
@@ -1049,7 +1049,7 @@
     </w:p>
     <w:p>
       <w:r>
-        <w:t xml:space="preserve">Original board for reference: https://eparker71.github.io/agile-ways-of-working/boards/a3-problem-solving-board.html</w:t>
+        <w:t xml:space="preserve">Original board for reference: https://eparker71.github.io/better-delivery-toolkit/boards/a3-problem-solving-board.html</w:t>
       </w:r>
     </w:p>
     <w:p>
@@ -1057,7 +1057,7 @@
         <w:pStyle w:val="Small"/>
       </w:pPr>
       <w:r>
-        <w:t xml:space="preserve">Boards: https://eparker71.github.io/agile-ways-of-working/boards/a3-problem-solving-board.html  ·  Online guide: https://eparker71.github.io/agile-ways-of-working/guides/facilitator-guide-a3-problem-solving.html</w:t>
+        <w:t xml:space="preserve">Boards: https://eparker71.github.io/better-delivery-toolkit/boards/a3-problem-solving-board.html  ·  Online guide: https://eparker71.github.io/better-delivery-toolkit/guides/facilitator-guide-a3-problem-solving.html</w:t>
       </w:r>
     </w:p>
     <w:p>
@@ -1065,7 +1065,7 @@
         <w:pStyle w:val="Small"/>
       </w:pPr>
       <w:r>
-        <w:t xml:space="preserve">© 2026 Eric Parker · CC BY 4.0 · eparker71.github.io/agile-ways-of-working · Adapt it freely; please keep the credit and say what you changed.</w:t>
+        <w:t xml:space="preserve">© 2026 Eric Parker · CC BY 4.0 · eparker71.github.io/better-delivery-toolkit · Adapt it freely; please keep the credit and say what you changed.</w:t>
       </w:r>
     </w:p>
     <w:sectPr>

</xml_diff>